<commit_message>
Remove o travessão de todos os entregáveis e passa a recusá-lo
- O renderizador recusa conteúdo com travessão, meia-risca ou hífen com
  espaços e lista os campos (dash_paths); hífen de palavra e item de lista
  continuam válidos.
- O design system não gera mais travessão: rótulos dos Test Cards e
  Learning Cards, linha das fontes, células vazias, faixas de nota, texto
  dos cards e marcadores do modelo PPTX.
- O guia de linguagem, o SKILL.md de cada skill e o README do design
  system trazem a regra; referências, modelos de mural, manifesto de fontes,
  avisos de terceiros, scripts (IQB, preferências) e amostras foram
  reescritos sem travessão. Transcrições de fontes e LICENSE ficam como
  estão.
- Amostras regeneradas, incluindo os HTMLs antigos que estavam fora do
  ciclo de regeneração.

Co-Authored-By: Claude Opus 5.5 <noreply@anthropic.com>
</commit_message>
<xml_diff>
--- a/_SAMPLES_ENTREGAVEIS/briefing_validation/sample-briefing-validation-v1.0.0.docx
+++ b/_SAMPLES_ENTREGAVEIS/briefing_validation/sample-briefing-validation-v1.0.0.docx
@@ -7,7 +7,7 @@
         <w:pStyle w:val="Title"/>
       </w:pPr>
       <w:r>
-        <w:t>EXEMPLO FICTÍCIO — Solicitações internas de dados</w:t>
+        <w:t>EXEMPLO FICTÍCIO: Solicitações internas de dados</w:t>
       </w:r>
     </w:p>
     <w:p>
@@ -4104,7 +4104,7 @@
               <w:rPr>
                 <w:sz w:val="16"/>
               </w:rPr>
-              <w:t>—</w:t>
+              <w:t>não informadas</w:t>
             </w:r>
           </w:p>
         </w:tc>
@@ -4132,7 +4132,7 @@
               <w:rPr>
                 <w:sz w:val="16"/>
               </w:rPr>
-              <w:t>—</w:t>
+              <w:t>não informadas</w:t>
             </w:r>
           </w:p>
         </w:tc>

</xml_diff>